<commit_message>
Fix procurement command order templates
</commit_message>
<xml_diff>
--- a/Template/Procurement/2.2 คำสั่งTOR.docx
+++ b/Template/Procurement/2.2 คำสั่งTOR.docx
@@ -185,38 +185,14 @@
             <w:pPr>
               <w:jc w:val="center"/>
               <w:rPr>
-                <w:rFonts w:ascii="TH SarabunIT๙" w:eastAsia="Times New Roman" w:hAnsi="TH SarabunIT๙" w:cs="TH SarabunIT๙"/>
-                <w:b/>
-                <w:bCs/>
-                <w:color w:val="000000"/>
-                <w:sz w:val="32"/>
-                <w:szCs w:val="32"/>
-              </w:rPr>
-            </w:pPr>
-            <w:r>
-              <w:rPr>
-                <w:rFonts w:ascii="TH SarabunIT๙" w:eastAsia="Times New Roman" w:hAnsi="TH SarabunIT๙" w:cs="TH SarabunIT๙"/>
-                <w:b/>
-                <w:bCs/>
-                <w:color w:val="000000"/>
-                <w:sz w:val="32"/>
-                <w:szCs w:val="32"/>
-                <w:cs/>
-              </w:rPr>
-              <w:t>ที่</w:t>
-            </w:r>
-            <w:r>
-              <w:rPr>
                 <w:rFonts w:ascii="TH SarabunIT๙" w:eastAsia="Times New Roman" w:hAnsi="TH SarabunIT๙" w:cs="TH SarabunIT๙" w:hint="cs"/>
                 <w:b/>
                 <w:bCs/>
                 <w:color w:val="000000"/>
                 <w:sz w:val="32"/>
                 <w:szCs w:val="32"/>
-                <w:cs/>
-              </w:rPr>
-              <w:t xml:space="preserve"> </w:t>
-            </w:r>
+              </w:rPr>
+            </w:pPr>
             <w:r>
               <w:rPr>
                 <w:rFonts w:ascii="TH SarabunIT๙" w:eastAsia="Times New Roman" w:hAnsi="TH SarabunIT๙" w:cs="TH SarabunIT๙"/>
@@ -225,8 +201,9 @@
                 <w:color w:val="000000"/>
                 <w:sz w:val="32"/>
                 <w:szCs w:val="32"/>
-              </w:rPr>
-              <w:t>{</w:t>
+                <w:cs/>
+              </w:rPr>
+              <w:t>ที่</w:t>
             </w:r>
             <w:r>
               <w:rPr>
@@ -238,7 +215,7 @@
                 <w:szCs w:val="32"/>
                 <w:cs/>
               </w:rPr>
-              <w:t>คำสั่งสเปค</w:t>
+              <w:t xml:space="preserve"> </w:t>
             </w:r>
             <w:r>
               <w:rPr>
@@ -249,29 +226,30 @@
                 <w:sz w:val="32"/>
                 <w:szCs w:val="32"/>
               </w:rPr>
-              <w:t>}</w:t>
-            </w:r>
-            <w:r>
-              <w:rPr>
-                <w:rFonts w:ascii="TH SarabunIT๙" w:eastAsia="Times New Roman" w:hAnsi="TH SarabunIT๙" w:cs="TH SarabunIT๙"/>
-                <w:b/>
-                <w:bCs/>
-                <w:sz w:val="32"/>
-                <w:szCs w:val="32"/>
-                <w:cs/>
-              </w:rPr>
-              <w:t>/๒๕๖</w:t>
+              <w:t>{</w:t>
             </w:r>
             <w:r>
               <w:rPr>
                 <w:rFonts w:ascii="TH SarabunIT๙" w:eastAsia="Times New Roman" w:hAnsi="TH SarabunIT๙" w:cs="TH SarabunIT๙" w:hint="cs"/>
                 <w:b/>
                 <w:bCs/>
-                <w:sz w:val="32"/>
-                <w:szCs w:val="32"/>
-                <w:cs/>
-              </w:rPr>
-              <w:t>9</w:t>
+                <w:color w:val="000000"/>
+                <w:sz w:val="32"/>
+                <w:szCs w:val="32"/>
+                <w:cs/>
+              </w:rPr>
+              <w:t>คำสั่งสเปค</w:t>
+            </w:r>
+            <w:r>
+              <w:rPr>
+                <w:rFonts w:ascii="TH SarabunIT๙" w:eastAsia="Times New Roman" w:hAnsi="TH SarabunIT๙" w:cs="TH SarabunIT๙"/>
+                <w:b/>
+                <w:bCs/>
+                <w:color w:val="000000"/>
+                <w:sz w:val="32"/>
+                <w:szCs w:val="32"/>
+              </w:rPr>
+              <w:t>}</w:t>
             </w:r>
           </w:p>
         </w:tc>

</xml_diff>

<commit_message>
Update procurement quotation templates
</commit_message>
<xml_diff>
--- a/Template/Procurement/2.2 คำสั่งTOR.docx
+++ b/Template/Procurement/2.2 คำสั่งTOR.docx
@@ -238,22 +238,8 @@
                 <w:szCs w:val="32"/>
                 <w:cs/>
               </w:rPr>
-              <w:t>คำสั่ง</w:t>
-            </w:r>
-            <w:proofErr w:type="spellStart"/>
-            <w:r>
-              <w:rPr>
-                <w:rFonts w:ascii="TH SarabunIT๙" w:eastAsia="Times New Roman" w:hAnsi="TH SarabunIT๙" w:cs="TH SarabunIT๙" w:hint="cs"/>
-                <w:b/>
-                <w:bCs/>
-                <w:color w:val="000000"/>
-                <w:sz w:val="32"/>
-                <w:szCs w:val="32"/>
-                <w:cs/>
-              </w:rPr>
-              <w:t>สเปค</w:t>
-            </w:r>
-            <w:proofErr w:type="spellEnd"/>
+              <w:t>คำสั่งสเปค</w:t>
+            </w:r>
             <w:r>
               <w:rPr>
                 <w:rFonts w:ascii="TH SarabunIT๙" w:eastAsia="Times New Roman" w:hAnsi="TH SarabunIT๙" w:cs="TH SarabunIT๙"/>
@@ -963,9 +949,16 @@
                 <w:szCs w:val="32"/>
                 <w:cs/>
               </w:rPr>
-              <w:t>คำนำหน้า</w:t>
-            </w:r>
-            <w:proofErr w:type="spellStart"/>
+              <w:t>คำนำหน้าสเปค</w:t>
+            </w:r>
+            <w:r>
+              <w:rPr>
+                <w:rFonts w:ascii="TH SarabunIT๙" w:eastAsia="Times New Roman" w:hAnsi="TH SarabunIT๙" w:cs="TH SarabunIT๙"/>
+                <w:sz w:val="32"/>
+                <w:szCs w:val="32"/>
+              </w:rPr>
+              <w:t>A}{</w:t>
+            </w:r>
             <w:r>
               <w:rPr>
                 <w:rFonts w:ascii="TH SarabunIT๙" w:eastAsia="Times New Roman" w:hAnsi="TH SarabunIT๙" w:cs="TH SarabunIT๙" w:hint="cs"/>
@@ -973,16 +966,15 @@
                 <w:szCs w:val="32"/>
                 <w:cs/>
               </w:rPr>
-              <w:t>สเปค</w:t>
-            </w:r>
-            <w:proofErr w:type="spellEnd"/>
-            <w:r>
-              <w:rPr>
-                <w:rFonts w:ascii="TH SarabunIT๙" w:eastAsia="Times New Roman" w:hAnsi="TH SarabunIT๙" w:cs="TH SarabunIT๙"/>
-                <w:sz w:val="32"/>
-                <w:szCs w:val="32"/>
-              </w:rPr>
-              <w:t>A}{</w:t>
+              <w:t>ชื่อสเปค</w:t>
+            </w:r>
+            <w:r>
+              <w:rPr>
+                <w:rFonts w:ascii="TH SarabunIT๙" w:eastAsia="Times New Roman" w:hAnsi="TH SarabunIT๙" w:cs="TH SarabunIT๙"/>
+                <w:sz w:val="32"/>
+                <w:szCs w:val="32"/>
+              </w:rPr>
+              <w:t>A}</w:t>
             </w:r>
             <w:r>
               <w:rPr>
@@ -991,9 +983,16 @@
                 <w:szCs w:val="32"/>
                 <w:cs/>
               </w:rPr>
-              <w:t>ชื่อ</w:t>
-            </w:r>
-            <w:proofErr w:type="spellStart"/>
+              <w:t xml:space="preserve"> </w:t>
+            </w:r>
+            <w:r>
+              <w:rPr>
+                <w:rFonts w:ascii="TH SarabunIT๙" w:eastAsia="Times New Roman" w:hAnsi="TH SarabunIT๙" w:cs="TH SarabunIT๙"/>
+                <w:sz w:val="32"/>
+                <w:szCs w:val="32"/>
+              </w:rPr>
+              <w:t>{</w:t>
+            </w:r>
             <w:r>
               <w:rPr>
                 <w:rFonts w:ascii="TH SarabunIT๙" w:eastAsia="Times New Roman" w:hAnsi="TH SarabunIT๙" w:cs="TH SarabunIT๙" w:hint="cs"/>
@@ -1001,54 +1000,8 @@
                 <w:szCs w:val="32"/>
                 <w:cs/>
               </w:rPr>
-              <w:t>สเปค</w:t>
-            </w:r>
-            <w:proofErr w:type="spellEnd"/>
-            <w:r>
-              <w:rPr>
-                <w:rFonts w:ascii="TH SarabunIT๙" w:eastAsia="Times New Roman" w:hAnsi="TH SarabunIT๙" w:cs="TH SarabunIT๙"/>
-                <w:sz w:val="32"/>
-                <w:szCs w:val="32"/>
-              </w:rPr>
-              <w:t>A}</w:t>
-            </w:r>
-            <w:r>
-              <w:rPr>
-                <w:rFonts w:ascii="TH SarabunIT๙" w:eastAsia="Times New Roman" w:hAnsi="TH SarabunIT๙" w:cs="TH SarabunIT๙" w:hint="cs"/>
-                <w:sz w:val="32"/>
-                <w:szCs w:val="32"/>
-                <w:cs/>
-              </w:rPr>
-              <w:t xml:space="preserve"> </w:t>
-            </w:r>
-            <w:r>
-              <w:rPr>
-                <w:rFonts w:ascii="TH SarabunIT๙" w:eastAsia="Times New Roman" w:hAnsi="TH SarabunIT๙" w:cs="TH SarabunIT๙"/>
-                <w:sz w:val="32"/>
-                <w:szCs w:val="32"/>
-              </w:rPr>
-              <w:t>{</w:t>
-            </w:r>
-            <w:r>
-              <w:rPr>
-                <w:rFonts w:ascii="TH SarabunIT๙" w:eastAsia="Times New Roman" w:hAnsi="TH SarabunIT๙" w:cs="TH SarabunIT๙" w:hint="cs"/>
-                <w:sz w:val="32"/>
-                <w:szCs w:val="32"/>
-                <w:cs/>
-              </w:rPr>
-              <w:t>นามสกุล</w:t>
-            </w:r>
-            <w:proofErr w:type="spellStart"/>
-            <w:r>
-              <w:rPr>
-                <w:rFonts w:ascii="TH SarabunIT๙" w:eastAsia="Times New Roman" w:hAnsi="TH SarabunIT๙" w:cs="TH SarabunIT๙" w:hint="cs"/>
-                <w:sz w:val="32"/>
-                <w:szCs w:val="32"/>
-                <w:cs/>
-              </w:rPr>
-              <w:t>สเปค</w:t>
-            </w:r>
-            <w:proofErr w:type="spellEnd"/>
+              <w:t>นามสกุลสเปค</w:t>
+            </w:r>
             <w:r>
               <w:rPr>
                 <w:rFonts w:ascii="TH SarabunIT๙" w:eastAsia="Times New Roman" w:hAnsi="TH SarabunIT๙" w:cs="TH SarabunIT๙"/>
@@ -1096,19 +1049,8 @@
                 <w:szCs w:val="32"/>
                 <w:cs/>
               </w:rPr>
-              <w:t>ตำแหน่ง</w:t>
-            </w:r>
-            <w:proofErr w:type="spellStart"/>
-            <w:r>
-              <w:rPr>
-                <w:rFonts w:ascii="TH SarabunIT๙" w:eastAsia="Times New Roman" w:hAnsi="TH SarabunIT๙" w:cs="TH SarabunIT๙" w:hint="cs"/>
-                <w:sz w:val="32"/>
-                <w:szCs w:val="32"/>
-                <w:cs/>
-              </w:rPr>
-              <w:t>สเปค</w:t>
-            </w:r>
-            <w:proofErr w:type="spellEnd"/>
+              <w:t>ตำแหน่งสเปค</w:t>
+            </w:r>
             <w:r>
               <w:rPr>
                 <w:rFonts w:ascii="TH SarabunIT๙" w:eastAsia="Times New Roman" w:hAnsi="TH SarabunIT๙" w:cs="TH SarabunIT๙"/>
@@ -1196,9 +1138,16 @@
                 <w:szCs w:val="32"/>
                 <w:cs/>
               </w:rPr>
-              <w:t>คำนำหน้า</w:t>
-            </w:r>
-            <w:proofErr w:type="spellStart"/>
+              <w:t>คำนำหน้าสเปค</w:t>
+            </w:r>
+            <w:r>
+              <w:rPr>
+                <w:rFonts w:ascii="TH SarabunIT๙" w:eastAsia="Times New Roman" w:hAnsi="TH SarabunIT๙" w:cs="TH SarabunIT๙"/>
+                <w:sz w:val="32"/>
+                <w:szCs w:val="32"/>
+              </w:rPr>
+              <w:t>B}{</w:t>
+            </w:r>
             <w:r>
               <w:rPr>
                 <w:rFonts w:ascii="TH SarabunIT๙" w:eastAsia="Times New Roman" w:hAnsi="TH SarabunIT๙" w:cs="TH SarabunIT๙" w:hint="cs"/>
@@ -1206,19 +1155,16 @@
                 <w:szCs w:val="32"/>
                 <w:cs/>
               </w:rPr>
-              <w:t>สเปค</w:t>
-            </w:r>
-            <w:proofErr w:type="spellEnd"/>
-            <w:proofErr w:type="gramStart"/>
-            <w:r>
-              <w:rPr>
-                <w:rFonts w:ascii="TH SarabunIT๙" w:eastAsia="Times New Roman" w:hAnsi="TH SarabunIT๙" w:cs="TH SarabunIT๙"/>
-                <w:sz w:val="32"/>
-                <w:szCs w:val="32"/>
-              </w:rPr>
-              <w:t>B}{</w:t>
-            </w:r>
-            <w:proofErr w:type="gramEnd"/>
+              <w:t>ชื่อสเปค</w:t>
+            </w:r>
+            <w:r>
+              <w:rPr>
+                <w:rFonts w:ascii="TH SarabunIT๙" w:eastAsia="Times New Roman" w:hAnsi="TH SarabunIT๙" w:cs="TH SarabunIT๙"/>
+                <w:sz w:val="32"/>
+                <w:szCs w:val="32"/>
+              </w:rPr>
+              <w:t>B}</w:t>
+            </w:r>
             <w:r>
               <w:rPr>
                 <w:rFonts w:ascii="TH SarabunIT๙" w:eastAsia="Times New Roman" w:hAnsi="TH SarabunIT๙" w:cs="TH SarabunIT๙" w:hint="cs"/>
@@ -1226,9 +1172,16 @@
                 <w:szCs w:val="32"/>
                 <w:cs/>
               </w:rPr>
-              <w:t>ชื่อ</w:t>
-            </w:r>
-            <w:proofErr w:type="spellStart"/>
+              <w:t xml:space="preserve"> </w:t>
+            </w:r>
+            <w:r>
+              <w:rPr>
+                <w:rFonts w:ascii="TH SarabunIT๙" w:eastAsia="Times New Roman" w:hAnsi="TH SarabunIT๙" w:cs="TH SarabunIT๙"/>
+                <w:sz w:val="32"/>
+                <w:szCs w:val="32"/>
+              </w:rPr>
+              <w:t>{</w:t>
+            </w:r>
             <w:r>
               <w:rPr>
                 <w:rFonts w:ascii="TH SarabunIT๙" w:eastAsia="Times New Roman" w:hAnsi="TH SarabunIT๙" w:cs="TH SarabunIT๙" w:hint="cs"/>
@@ -1236,54 +1189,8 @@
                 <w:szCs w:val="32"/>
                 <w:cs/>
               </w:rPr>
-              <w:t>สเปค</w:t>
-            </w:r>
-            <w:proofErr w:type="spellEnd"/>
-            <w:r>
-              <w:rPr>
-                <w:rFonts w:ascii="TH SarabunIT๙" w:eastAsia="Times New Roman" w:hAnsi="TH SarabunIT๙" w:cs="TH SarabunIT๙"/>
-                <w:sz w:val="32"/>
-                <w:szCs w:val="32"/>
-              </w:rPr>
-              <w:t>B}</w:t>
-            </w:r>
-            <w:r>
-              <w:rPr>
-                <w:rFonts w:ascii="TH SarabunIT๙" w:eastAsia="Times New Roman" w:hAnsi="TH SarabunIT๙" w:cs="TH SarabunIT๙" w:hint="cs"/>
-                <w:sz w:val="32"/>
-                <w:szCs w:val="32"/>
-                <w:cs/>
-              </w:rPr>
-              <w:t xml:space="preserve"> </w:t>
-            </w:r>
-            <w:r>
-              <w:rPr>
-                <w:rFonts w:ascii="TH SarabunIT๙" w:eastAsia="Times New Roman" w:hAnsi="TH SarabunIT๙" w:cs="TH SarabunIT๙"/>
-                <w:sz w:val="32"/>
-                <w:szCs w:val="32"/>
-              </w:rPr>
-              <w:t>{</w:t>
-            </w:r>
-            <w:r>
-              <w:rPr>
-                <w:rFonts w:ascii="TH SarabunIT๙" w:eastAsia="Times New Roman" w:hAnsi="TH SarabunIT๙" w:cs="TH SarabunIT๙" w:hint="cs"/>
-                <w:sz w:val="32"/>
-                <w:szCs w:val="32"/>
-                <w:cs/>
-              </w:rPr>
-              <w:t>นามสกุล</w:t>
-            </w:r>
-            <w:proofErr w:type="spellStart"/>
-            <w:r>
-              <w:rPr>
-                <w:rFonts w:ascii="TH SarabunIT๙" w:eastAsia="Times New Roman" w:hAnsi="TH SarabunIT๙" w:cs="TH SarabunIT๙" w:hint="cs"/>
-                <w:sz w:val="32"/>
-                <w:szCs w:val="32"/>
-                <w:cs/>
-              </w:rPr>
-              <w:t>สเปค</w:t>
-            </w:r>
-            <w:proofErr w:type="spellEnd"/>
+              <w:t>นามสกุลสเปค</w:t>
+            </w:r>
             <w:r>
               <w:rPr>
                 <w:rFonts w:ascii="TH SarabunIT๙" w:eastAsia="Times New Roman" w:hAnsi="TH SarabunIT๙" w:cs="TH SarabunIT๙"/>
@@ -1331,19 +1238,8 @@
                 <w:szCs w:val="32"/>
                 <w:cs/>
               </w:rPr>
-              <w:t>ตำแหน่ง</w:t>
-            </w:r>
-            <w:proofErr w:type="spellStart"/>
-            <w:r>
-              <w:rPr>
-                <w:rFonts w:ascii="TH SarabunIT๙" w:eastAsia="Times New Roman" w:hAnsi="TH SarabunIT๙" w:cs="TH SarabunIT๙" w:hint="cs"/>
-                <w:sz w:val="32"/>
-                <w:szCs w:val="32"/>
-                <w:cs/>
-              </w:rPr>
-              <w:t>สเปค</w:t>
-            </w:r>
-            <w:proofErr w:type="spellEnd"/>
+              <w:t>ตำแหน่งสเปค</w:t>
+            </w:r>
             <w:r>
               <w:rPr>
                 <w:rFonts w:ascii="TH SarabunIT๙" w:eastAsia="Times New Roman" w:hAnsi="TH SarabunIT๙" w:cs="TH SarabunIT๙"/>
@@ -1431,9 +1327,16 @@
                 <w:szCs w:val="32"/>
                 <w:cs/>
               </w:rPr>
-              <w:t>คำนำหน้า</w:t>
-            </w:r>
-            <w:proofErr w:type="spellStart"/>
+              <w:t>คำนำหน้าสเปค</w:t>
+            </w:r>
+            <w:r>
+              <w:rPr>
+                <w:rFonts w:ascii="TH SarabunIT๙" w:eastAsia="Times New Roman" w:hAnsi="TH SarabunIT๙" w:cs="TH SarabunIT๙"/>
+                <w:sz w:val="32"/>
+                <w:szCs w:val="32"/>
+              </w:rPr>
+              <w:t>C}{</w:t>
+            </w:r>
             <w:r>
               <w:rPr>
                 <w:rFonts w:ascii="TH SarabunIT๙" w:eastAsia="Times New Roman" w:hAnsi="TH SarabunIT๙" w:cs="TH SarabunIT๙" w:hint="cs"/>
@@ -1441,19 +1344,16 @@
                 <w:szCs w:val="32"/>
                 <w:cs/>
               </w:rPr>
-              <w:t>สเปค</w:t>
-            </w:r>
-            <w:proofErr w:type="spellEnd"/>
-            <w:proofErr w:type="gramStart"/>
-            <w:r>
-              <w:rPr>
-                <w:rFonts w:ascii="TH SarabunIT๙" w:eastAsia="Times New Roman" w:hAnsi="TH SarabunIT๙" w:cs="TH SarabunIT๙"/>
-                <w:sz w:val="32"/>
-                <w:szCs w:val="32"/>
-              </w:rPr>
-              <w:t>C}{</w:t>
-            </w:r>
-            <w:proofErr w:type="gramEnd"/>
+              <w:t>ชื่อสเปค</w:t>
+            </w:r>
+            <w:r>
+              <w:rPr>
+                <w:rFonts w:ascii="TH SarabunIT๙" w:eastAsia="Times New Roman" w:hAnsi="TH SarabunIT๙" w:cs="TH SarabunIT๙"/>
+                <w:sz w:val="32"/>
+                <w:szCs w:val="32"/>
+              </w:rPr>
+              <w:t>C}</w:t>
+            </w:r>
             <w:r>
               <w:rPr>
                 <w:rFonts w:ascii="TH SarabunIT๙" w:eastAsia="Times New Roman" w:hAnsi="TH SarabunIT๙" w:cs="TH SarabunIT๙" w:hint="cs"/>
@@ -1461,9 +1361,16 @@
                 <w:szCs w:val="32"/>
                 <w:cs/>
               </w:rPr>
-              <w:t>ชื่อ</w:t>
-            </w:r>
-            <w:proofErr w:type="spellStart"/>
+              <w:t xml:space="preserve"> </w:t>
+            </w:r>
+            <w:r>
+              <w:rPr>
+                <w:rFonts w:ascii="TH SarabunIT๙" w:eastAsia="Times New Roman" w:hAnsi="TH SarabunIT๙" w:cs="TH SarabunIT๙"/>
+                <w:sz w:val="32"/>
+                <w:szCs w:val="32"/>
+              </w:rPr>
+              <w:t>{</w:t>
+            </w:r>
             <w:r>
               <w:rPr>
                 <w:rFonts w:ascii="TH SarabunIT๙" w:eastAsia="Times New Roman" w:hAnsi="TH SarabunIT๙" w:cs="TH SarabunIT๙" w:hint="cs"/>
@@ -1471,54 +1378,8 @@
                 <w:szCs w:val="32"/>
                 <w:cs/>
               </w:rPr>
-              <w:t>สเปค</w:t>
-            </w:r>
-            <w:proofErr w:type="spellEnd"/>
-            <w:r>
-              <w:rPr>
-                <w:rFonts w:ascii="TH SarabunIT๙" w:eastAsia="Times New Roman" w:hAnsi="TH SarabunIT๙" w:cs="TH SarabunIT๙"/>
-                <w:sz w:val="32"/>
-                <w:szCs w:val="32"/>
-              </w:rPr>
-              <w:t>C}</w:t>
-            </w:r>
-            <w:r>
-              <w:rPr>
-                <w:rFonts w:ascii="TH SarabunIT๙" w:eastAsia="Times New Roman" w:hAnsi="TH SarabunIT๙" w:cs="TH SarabunIT๙" w:hint="cs"/>
-                <w:sz w:val="32"/>
-                <w:szCs w:val="32"/>
-                <w:cs/>
-              </w:rPr>
-              <w:t xml:space="preserve"> </w:t>
-            </w:r>
-            <w:r>
-              <w:rPr>
-                <w:rFonts w:ascii="TH SarabunIT๙" w:eastAsia="Times New Roman" w:hAnsi="TH SarabunIT๙" w:cs="TH SarabunIT๙"/>
-                <w:sz w:val="32"/>
-                <w:szCs w:val="32"/>
-              </w:rPr>
-              <w:t>{</w:t>
-            </w:r>
-            <w:r>
-              <w:rPr>
-                <w:rFonts w:ascii="TH SarabunIT๙" w:eastAsia="Times New Roman" w:hAnsi="TH SarabunIT๙" w:cs="TH SarabunIT๙" w:hint="cs"/>
-                <w:sz w:val="32"/>
-                <w:szCs w:val="32"/>
-                <w:cs/>
-              </w:rPr>
-              <w:t>นามสกุล</w:t>
-            </w:r>
-            <w:proofErr w:type="spellStart"/>
-            <w:r>
-              <w:rPr>
-                <w:rFonts w:ascii="TH SarabunIT๙" w:eastAsia="Times New Roman" w:hAnsi="TH SarabunIT๙" w:cs="TH SarabunIT๙" w:hint="cs"/>
-                <w:sz w:val="32"/>
-                <w:szCs w:val="32"/>
-                <w:cs/>
-              </w:rPr>
-              <w:t>สเปค</w:t>
-            </w:r>
-            <w:proofErr w:type="spellEnd"/>
+              <w:t>นามสกุลสเปค</w:t>
+            </w:r>
             <w:r>
               <w:rPr>
                 <w:rFonts w:ascii="TH SarabunIT๙" w:eastAsia="Times New Roman" w:hAnsi="TH SarabunIT๙" w:cs="TH SarabunIT๙"/>
@@ -1566,19 +1427,8 @@
                 <w:szCs w:val="32"/>
                 <w:cs/>
               </w:rPr>
-              <w:t>ตำแหน่ง</w:t>
-            </w:r>
-            <w:proofErr w:type="spellStart"/>
-            <w:r>
-              <w:rPr>
-                <w:rFonts w:ascii="TH SarabunIT๙" w:eastAsia="Times New Roman" w:hAnsi="TH SarabunIT๙" w:cs="TH SarabunIT๙" w:hint="cs"/>
-                <w:sz w:val="32"/>
-                <w:szCs w:val="32"/>
-                <w:cs/>
-              </w:rPr>
-              <w:t>สเปค</w:t>
-            </w:r>
-            <w:proofErr w:type="spellEnd"/>
+              <w:t>ตำแหน่งสเปค</w:t>
+            </w:r>
             <w:r>
               <w:rPr>
                 <w:rFonts w:ascii="TH SarabunIT๙" w:eastAsia="Times New Roman" w:hAnsi="TH SarabunIT๙" w:cs="TH SarabunIT๙"/>
@@ -1943,20 +1793,8 @@
                                 <w:szCs w:val="32"/>
                                 <w:cs/>
                               </w:rPr>
-                              <w:t>คำนำหน้า</w:t>
+                              <w:t>คำนำหน้าผอ</w:t>
                             </w:r>
-                            <w:proofErr w:type="spellStart"/>
-                            <w:r>
-                              <w:rPr>
-                                <w:rFonts w:ascii="TH SarabunIT๙" w:hAnsi="TH SarabunIT๙" w:cs="TH SarabunIT๙" w:hint="cs"/>
-                                <w:spacing w:val="-10"/>
-                                <w:sz w:val="32"/>
-                                <w:szCs w:val="32"/>
-                                <w:cs/>
-                              </w:rPr>
-                              <w:t>ผอ</w:t>
-                            </w:r>
-                            <w:proofErr w:type="spellEnd"/>
                             <w:r>
                               <w:rPr>
                                 <w:rFonts w:ascii="TH SarabunIT๙" w:hAnsi="TH SarabunIT๙" w:cs="TH SarabunIT๙"/>
@@ -1974,20 +1812,8 @@
                                 <w:szCs w:val="32"/>
                                 <w:cs/>
                               </w:rPr>
-                              <w:t>ชื่อ</w:t>
+                              <w:t>ชื่อผอ</w:t>
                             </w:r>
-                            <w:proofErr w:type="spellStart"/>
-                            <w:r>
-                              <w:rPr>
-                                <w:rFonts w:ascii="TH SarabunIT๙" w:hAnsi="TH SarabunIT๙" w:cs="TH SarabunIT๙" w:hint="cs"/>
-                                <w:spacing w:val="-10"/>
-                                <w:sz w:val="32"/>
-                                <w:szCs w:val="32"/>
-                                <w:cs/>
-                              </w:rPr>
-                              <w:t>ผอ</w:t>
-                            </w:r>
-                            <w:proofErr w:type="spellEnd"/>
                             <w:r>
                               <w:rPr>
                                 <w:rFonts w:ascii="TH SarabunIT๙" w:hAnsi="TH SarabunIT๙" w:cs="TH SarabunIT๙"/>
@@ -2024,20 +1850,8 @@
                                 <w:szCs w:val="32"/>
                                 <w:cs/>
                               </w:rPr>
-                              <w:t>นามสกุล</w:t>
+                              <w:t>นามสกุลผอ</w:t>
                             </w:r>
-                            <w:proofErr w:type="spellStart"/>
-                            <w:r>
-                              <w:rPr>
-                                <w:rFonts w:ascii="TH SarabunIT๙" w:hAnsi="TH SarabunIT๙" w:cs="TH SarabunIT๙" w:hint="cs"/>
-                                <w:spacing w:val="-10"/>
-                                <w:sz w:val="32"/>
-                                <w:szCs w:val="32"/>
-                                <w:cs/>
-                              </w:rPr>
-                              <w:t>ผอ</w:t>
-                            </w:r>
-                            <w:proofErr w:type="spellEnd"/>
                             <w:r>
                               <w:rPr>
                                 <w:rFonts w:ascii="TH SarabunIT๙" w:hAnsi="TH SarabunIT๙" w:cs="TH SarabunIT๙"/>
@@ -2172,20 +1986,8 @@
                           <w:szCs w:val="32"/>
                           <w:cs/>
                         </w:rPr>
-                        <w:t>คำนำหน้า</w:t>
+                        <w:t>คำนำหน้าผอ</w:t>
                       </w:r>
-                      <w:proofErr w:type="spellStart"/>
-                      <w:r>
-                        <w:rPr>
-                          <w:rFonts w:ascii="TH SarabunIT๙" w:hAnsi="TH SarabunIT๙" w:cs="TH SarabunIT๙" w:hint="cs"/>
-                          <w:spacing w:val="-10"/>
-                          <w:sz w:val="32"/>
-                          <w:szCs w:val="32"/>
-                          <w:cs/>
-                        </w:rPr>
-                        <w:t>ผอ</w:t>
-                      </w:r>
-                      <w:proofErr w:type="spellEnd"/>
                       <w:r>
                         <w:rPr>
                           <w:rFonts w:ascii="TH SarabunIT๙" w:hAnsi="TH SarabunIT๙" w:cs="TH SarabunIT๙"/>
@@ -2203,20 +2005,8 @@
                           <w:szCs w:val="32"/>
                           <w:cs/>
                         </w:rPr>
-                        <w:t>ชื่อ</w:t>
+                        <w:t>ชื่อผอ</w:t>
                       </w:r>
-                      <w:proofErr w:type="spellStart"/>
-                      <w:r>
-                        <w:rPr>
-                          <w:rFonts w:ascii="TH SarabunIT๙" w:hAnsi="TH SarabunIT๙" w:cs="TH SarabunIT๙" w:hint="cs"/>
-                          <w:spacing w:val="-10"/>
-                          <w:sz w:val="32"/>
-                          <w:szCs w:val="32"/>
-                          <w:cs/>
-                        </w:rPr>
-                        <w:t>ผอ</w:t>
-                      </w:r>
-                      <w:proofErr w:type="spellEnd"/>
                       <w:r>
                         <w:rPr>
                           <w:rFonts w:ascii="TH SarabunIT๙" w:hAnsi="TH SarabunIT๙" w:cs="TH SarabunIT๙"/>
@@ -2253,20 +2043,8 @@
                           <w:szCs w:val="32"/>
                           <w:cs/>
                         </w:rPr>
-                        <w:t>นามสกุล</w:t>
+                        <w:t>นามสกุลผอ</w:t>
                       </w:r>
-                      <w:proofErr w:type="spellStart"/>
-                      <w:r>
-                        <w:rPr>
-                          <w:rFonts w:ascii="TH SarabunIT๙" w:hAnsi="TH SarabunIT๙" w:cs="TH SarabunIT๙" w:hint="cs"/>
-                          <w:spacing w:val="-10"/>
-                          <w:sz w:val="32"/>
-                          <w:szCs w:val="32"/>
-                          <w:cs/>
-                        </w:rPr>
-                        <w:t>ผอ</w:t>
-                      </w:r>
-                      <w:proofErr w:type="spellEnd"/>
                       <w:r>
                         <w:rPr>
                           <w:rFonts w:ascii="TH SarabunIT๙" w:hAnsi="TH SarabunIT๙" w:cs="TH SarabunIT๙"/>

</xml_diff>